<commit_message>
matlab 8 and 9, 10
</commit_message>
<xml_diff>
--- a/Matlab/lab 10/отчет.docx
+++ b/Matlab/lab 10/отчет.docx
@@ -179,7 +179,7 @@
           <w:color w:val="00000A"/>
           <w:lang w:eastAsia="ru-RU"/>
         </w:rPr>
-        <w:t>9</w:t>
+        <w:t>10</w:t>
       </w:r>
     </w:p>
     <w:p>
@@ -1096,6 +1096,7 @@
       <w:r>
         <w:rPr>
           <w:rFonts w:eastAsia="Times New Roman" w:cs="Times New Roman"/>
+          <w:noProof/>
           <w:color w:val="00000A"/>
           <w:szCs w:val="24"/>
           <w:lang w:val="en-US" w:eastAsia="ru-RU"/>
@@ -1152,6 +1153,7 @@
       <w:r>
         <w:rPr>
           <w:rFonts w:eastAsia="Times New Roman" w:cs="Times New Roman"/>
+          <w:noProof/>
           <w:color w:val="00000A"/>
           <w:szCs w:val="24"/>
           <w:lang w:val="en-US" w:eastAsia="ru-RU"/>
@@ -1475,7 +1477,7 @@
           <w:rFonts w:eastAsia="Times New Roman" w:cs="Times New Roman"/>
           <w:color w:val="00000A"/>
           <w:szCs w:val="24"/>
-          <w:lang w:val="en-US" w:eastAsia="ru-RU"/>
+          <w:lang w:eastAsia="ru-RU"/>
         </w:rPr>
       </w:pPr>
       <w:r>
@@ -1497,7 +1499,7 @@
           <w:rFonts w:eastAsia="Times New Roman" w:cs="Times New Roman"/>
           <w:color w:val="00000A"/>
           <w:szCs w:val="24"/>
-          <w:lang w:val="en-US" w:eastAsia="ru-RU"/>
+          <w:lang w:eastAsia="ru-RU"/>
         </w:rPr>
       </w:pPr>
       <w:r>
@@ -1541,7 +1543,7 @@
           <w:rFonts w:eastAsia="Times New Roman" w:cs="Times New Roman"/>
           <w:color w:val="00000A"/>
           <w:szCs w:val="24"/>
-          <w:lang w:val="en-US" w:eastAsia="ru-RU"/>
+          <w:lang w:eastAsia="ru-RU"/>
         </w:rPr>
       </w:pPr>
     </w:p>
@@ -1945,33 +1947,33 @@
           <w:rFonts w:eastAsia="Times New Roman" w:cs="Times New Roman"/>
           <w:color w:val="00000A"/>
           <w:szCs w:val="24"/>
-          <w:lang w:val="en-US" w:eastAsia="ru-RU"/>
-        </w:rPr>
-      </w:pPr>
-    </w:p>
-    <w:p>
-      <w:pPr>
-        <w:suppressAutoHyphens/>
-        <w:spacing w:after="200" w:line="240" w:lineRule="auto"/>
-        <w:ind w:firstLine="0"/>
-        <w:rPr>
-          <w:rFonts w:eastAsia="Times New Roman" w:cs="Times New Roman"/>
-          <w:color w:val="00000A"/>
-          <w:szCs w:val="24"/>
-          <w:lang w:val="en-US" w:eastAsia="ru-RU"/>
-        </w:rPr>
-      </w:pPr>
-    </w:p>
-    <w:p>
-      <w:pPr>
-        <w:suppressAutoHyphens/>
-        <w:spacing w:after="200" w:line="240" w:lineRule="auto"/>
-        <w:ind w:firstLine="0"/>
-        <w:rPr>
-          <w:rFonts w:eastAsia="Times New Roman" w:cs="Times New Roman"/>
-          <w:color w:val="00000A"/>
-          <w:szCs w:val="24"/>
-          <w:lang w:val="en-US" w:eastAsia="ru-RU"/>
+          <w:lang w:eastAsia="ru-RU"/>
+        </w:rPr>
+      </w:pPr>
+    </w:p>
+    <w:p>
+      <w:pPr>
+        <w:suppressAutoHyphens/>
+        <w:spacing w:after="200" w:line="240" w:lineRule="auto"/>
+        <w:ind w:firstLine="0"/>
+        <w:rPr>
+          <w:rFonts w:eastAsia="Times New Roman" w:cs="Times New Roman"/>
+          <w:color w:val="00000A"/>
+          <w:szCs w:val="24"/>
+          <w:lang w:eastAsia="ru-RU"/>
+        </w:rPr>
+      </w:pPr>
+    </w:p>
+    <w:p>
+      <w:pPr>
+        <w:suppressAutoHyphens/>
+        <w:spacing w:after="200" w:line="240" w:lineRule="auto"/>
+        <w:ind w:firstLine="0"/>
+        <w:rPr>
+          <w:rFonts w:eastAsia="Times New Roman" w:cs="Times New Roman"/>
+          <w:color w:val="00000A"/>
+          <w:szCs w:val="24"/>
+          <w:lang w:eastAsia="ru-RU"/>
         </w:rPr>
       </w:pPr>
     </w:p>
@@ -2433,27 +2435,7 @@
           <w:szCs w:val="24"/>
           <w:lang w:val="en-US" w:eastAsia="ru-RU"/>
         </w:rPr>
-        <w:t xml:space="preserve">    ____________</w:t>
-      </w:r>
-      <w:proofErr w:type="gramStart"/>
-      <w:r>
-        <w:rPr>
-          <w:rFonts w:eastAsia="Times New Roman" w:cs="Times New Roman"/>
-          <w:color w:val="00000A"/>
-          <w:szCs w:val="24"/>
-          <w:lang w:val="en-US" w:eastAsia="ru-RU"/>
-        </w:rPr>
-        <w:t xml:space="preserve">    ________________    </w:t>
-      </w:r>
-      <w:proofErr w:type="gramEnd"/>
-      <w:r>
-        <w:rPr>
-          <w:rFonts w:eastAsia="Times New Roman" w:cs="Times New Roman"/>
-          <w:color w:val="00000A"/>
-          <w:szCs w:val="24"/>
-          <w:lang w:val="en-US" w:eastAsia="ru-RU"/>
-        </w:rPr>
-        <w:t>____________________</w:t>
+        <w:t xml:space="preserve">    ____________    ________________    ____________________</w:t>
       </w:r>
     </w:p>
     <w:p>

</xml_diff>